<commit_message>
Actualizar Julian: 9 semanas, actividades reales sem 1-4, tutor academico con cedula
</commit_message>
<xml_diff>
--- a/juliano/reportes/Informe_Pasantia_IUTECP.docx
+++ b/juliano/reportes/Informe_Pasantia_IUTECP.docx
@@ -241,11 +241,20 @@
           <w:sz w:val="24"/>
         </w:rPr>
         <w:t>Tutor Académico: Lic. Carlos Mendoza</w:t>
+        <w:br/>
+      </w:r>
+      <w:r>
+        <w:rPr>
+          <w:rFonts w:ascii="Times New Roman" w:hAnsi="Times New Roman"/>
+          <w:b/>
+          <w:sz w:val="24"/>
+        </w:rPr>
+        <w:t>C.I.: 4.273.815</w:t>
       </w:r>
     </w:p>
     <w:p>
       <w:pPr>
-        <w:spacing w:line="276" w:lineRule="auto" w:before="929" w:after="0"/>
+        <w:spacing w:line="276" w:lineRule="auto" w:before="653" w:after="0"/>
         <w:jc w:val="center"/>
       </w:pPr>
       <w:r>
@@ -1578,7 +1587,7 @@
         </w:rPr>
         <w:t>2</w:t>
         <w:tab/>
-        <w:t>Cronograma de actividades del proyecto factible</w:t>
+        <w:t>Cronograma de actividades del proyecto factible (9 semanas)</w:t>
         <w:tab/>
       </w:r>
       <w:r>
@@ -3439,7 +3448,7 @@
           <w:i w:val="0"/>
           <w:sz w:val="24"/>
         </w:rPr>
-        <w:t>El cronograma estructura temporalmente las fases de diseño y desarrollo del sistema automatizado, distribuidas a lo largo de las ocho (8) semanas de duración de la pasantía:</w:t>
+        <w:t>El cronograma estructura temporalmente las fases de diseño y desarrollo del sistema automatizado, distribuidas a lo largo de las nueve (9) semanas de duración de la pasantía:</w:t>
       </w:r>
     </w:p>
     <w:p>
@@ -3474,7 +3483,8 @@
         <w:tblLayout w:type="fixed"/>
       </w:tblPr>
       <w:tblGrid>
-        <w:gridCol w:w="4873"/>
+        <w:gridCol w:w="4448"/>
+        <w:gridCol w:w="424"/>
         <w:gridCol w:w="424"/>
         <w:gridCol w:w="424"/>
         <w:gridCol w:w="424"/>
@@ -3487,7 +3497,7 @@
       <w:tr>
         <w:tc>
           <w:tcPr>
-            <w:tcW w:w="4873" w:type="dxa"/>
+            <w:tcW w:w="4448" w:type="dxa"/>
             <w:shd w:val="clear" w:color="auto" w:fill="4472C4"/>
           </w:tcPr>
           <w:p>
@@ -3674,11 +3684,32 @@
             </w:r>
           </w:p>
         </w:tc>
+        <w:tc>
+          <w:tcPr>
+            <w:tcW w:w="424" w:type="dxa"/>
+            <w:shd w:val="clear" w:color="auto" w:fill="4472C4"/>
+          </w:tcPr>
+          <w:p>
+            <w:pPr>
+              <w:spacing w:before="60" w:after="60" w:line="240" w:lineRule="auto"/>
+              <w:jc w:val="center"/>
+            </w:pPr>
+            <w:r>
+              <w:rPr>
+                <w:rFonts w:ascii="Times New Roman" w:hAnsi="Times New Roman"/>
+                <w:b/>
+                <w:color w:val="FFFFFF"/>
+                <w:sz w:val="18"/>
+              </w:rPr>
+              <w:t>S9</w:t>
+            </w:r>
+          </w:p>
+        </w:tc>
       </w:tr>
       <w:tr>
         <w:tc>
           <w:tcPr>
-            <w:tcW w:w="4873" w:type="dxa"/>
+            <w:tcW w:w="4448" w:type="dxa"/>
             <w:shd w:val="clear" w:color="auto" w:fill="FFFFFF"/>
           </w:tcPr>
           <w:p>
@@ -3693,7 +3724,7 @@
                 <w:color w:val="000000"/>
                 <w:sz w:val="20"/>
               </w:rPr>
-              <w:t>Diagnóstico del flujo documental y debilidades del Excel.</w:t>
+              <w:t>Diagnóstico del flujo documental y levantamiento de requerimientos.</w:t>
             </w:r>
           </w:p>
         </w:tc>
@@ -3858,11 +3889,31 @@
             </w:r>
           </w:p>
         </w:tc>
+        <w:tc>
+          <w:tcPr>
+            <w:tcW w:w="424" w:type="dxa"/>
+            <w:shd w:val="clear" w:color="auto" w:fill="FFFFFF"/>
+          </w:tcPr>
+          <w:p>
+            <w:pPr>
+              <w:spacing w:before="60" w:after="60" w:line="240" w:lineRule="auto"/>
+              <w:jc w:val="center"/>
+            </w:pPr>
+            <w:r>
+              <w:rPr>
+                <w:rFonts w:ascii="Times New Roman" w:hAnsi="Times New Roman"/>
+                <w:b w:val="0"/>
+                <w:color w:val="000000"/>
+                <w:sz w:val="18"/>
+              </w:rPr>
+            </w:r>
+          </w:p>
+        </w:tc>
       </w:tr>
       <w:tr>
         <w:tc>
           <w:tcPr>
-            <w:tcW w:w="4873" w:type="dxa"/>
+            <w:tcW w:w="4448" w:type="dxa"/>
             <w:shd w:val="clear" w:color="auto" w:fill="D9E1F2"/>
           </w:tcPr>
           <w:p>
@@ -3877,7 +3928,7 @@
                 <w:color w:val="000000"/>
                 <w:sz w:val="20"/>
               </w:rPr>
-              <w:t>Diseño del modelo relacional y diccionario de datos.</w:t>
+              <w:t>Diseño del modelo relacional, normalización y diccionario de datos.</w:t>
             </w:r>
           </w:p>
         </w:tc>
@@ -4042,11 +4093,31 @@
             </w:r>
           </w:p>
         </w:tc>
+        <w:tc>
+          <w:tcPr>
+            <w:tcW w:w="424" w:type="dxa"/>
+            <w:shd w:val="clear" w:color="auto" w:fill="D9E1F2"/>
+          </w:tcPr>
+          <w:p>
+            <w:pPr>
+              <w:spacing w:before="60" w:after="60" w:line="240" w:lineRule="auto"/>
+              <w:jc w:val="center"/>
+            </w:pPr>
+            <w:r>
+              <w:rPr>
+                <w:rFonts w:ascii="Times New Roman" w:hAnsi="Times New Roman"/>
+                <w:b w:val="0"/>
+                <w:color w:val="000000"/>
+                <w:sz w:val="18"/>
+              </w:rPr>
+            </w:r>
+          </w:p>
+        </w:tc>
       </w:tr>
       <w:tr>
         <w:tc>
           <w:tcPr>
-            <w:tcW w:w="4873" w:type="dxa"/>
+            <w:tcW w:w="4448" w:type="dxa"/>
             <w:shd w:val="clear" w:color="auto" w:fill="FFFFFF"/>
           </w:tcPr>
           <w:p>
@@ -4061,7 +4132,7 @@
                 <w:color w:val="000000"/>
                 <w:sz w:val="20"/>
               </w:rPr>
-              <w:t>Despliegue de la DB en SQLite y maquetado lógico.</w:t>
+              <w:t>Implementación de la base de datos relacional en SQLite.</w:t>
             </w:r>
           </w:p>
         </w:tc>
@@ -4226,11 +4297,31 @@
             </w:r>
           </w:p>
         </w:tc>
+        <w:tc>
+          <w:tcPr>
+            <w:tcW w:w="424" w:type="dxa"/>
+            <w:shd w:val="clear" w:color="auto" w:fill="FFFFFF"/>
+          </w:tcPr>
+          <w:p>
+            <w:pPr>
+              <w:spacing w:before="60" w:after="60" w:line="240" w:lineRule="auto"/>
+              <w:jc w:val="center"/>
+            </w:pPr>
+            <w:r>
+              <w:rPr>
+                <w:rFonts w:ascii="Times New Roman" w:hAnsi="Times New Roman"/>
+                <w:b w:val="0"/>
+                <w:color w:val="000000"/>
+                <w:sz w:val="18"/>
+              </w:rPr>
+            </w:r>
+          </w:p>
+        </w:tc>
       </w:tr>
       <w:tr>
         <w:tc>
           <w:tcPr>
-            <w:tcW w:w="4873" w:type="dxa"/>
+            <w:tcW w:w="4448" w:type="dxa"/>
             <w:shd w:val="clear" w:color="auto" w:fill="D9E1F2"/>
           </w:tcPr>
           <w:p>
@@ -4245,7 +4336,7 @@
                 <w:color w:val="000000"/>
                 <w:sz w:val="20"/>
               </w:rPr>
-              <w:t>Programación de interfaces gráficas mediante código HTML.</w:t>
+              <w:t>Desarrollo de la interfaz gráfica y empaquetado con Wails.</w:t>
             </w:r>
           </w:p>
         </w:tc>
@@ -4306,6 +4397,27 @@
                 <w:color w:val="000000"/>
                 <w:sz w:val="18"/>
               </w:rPr>
+            </w:r>
+          </w:p>
+        </w:tc>
+        <w:tc>
+          <w:tcPr>
+            <w:tcW w:w="424" w:type="dxa"/>
+            <w:shd w:val="clear" w:color="auto" w:fill="70AD47"/>
+          </w:tcPr>
+          <w:p>
+            <w:pPr>
+              <w:spacing w:before="60" w:after="60" w:line="240" w:lineRule="auto"/>
+              <w:jc w:val="center"/>
+            </w:pPr>
+            <w:r>
+              <w:rPr>
+                <w:rFonts w:ascii="Times New Roman" w:hAnsi="Times New Roman"/>
+                <w:b w:val="0"/>
+                <w:color w:val="FFFFFF"/>
+                <w:sz w:val="18"/>
+              </w:rPr>
+              <w:t>✓</w:t>
             </w:r>
           </w:p>
         </w:tc>
@@ -4414,7 +4526,7 @@
       <w:tr>
         <w:tc>
           <w:tcPr>
-            <w:tcW w:w="4873" w:type="dxa"/>
+            <w:tcW w:w="4448" w:type="dxa"/>
             <w:shd w:val="clear" w:color="auto" w:fill="FFFFFF"/>
           </w:tcPr>
           <w:p>
@@ -4429,375 +4541,7 @@
                 <w:color w:val="000000"/>
                 <w:sz w:val="20"/>
               </w:rPr>
-              <w:t>Empaquetado de la aplicación de escritorio usando Wails.</w:t>
-            </w:r>
-          </w:p>
-        </w:tc>
-        <w:tc>
-          <w:tcPr>
-            <w:tcW w:w="424" w:type="dxa"/>
-            <w:shd w:val="clear" w:color="auto" w:fill="FFFFFF"/>
-          </w:tcPr>
-          <w:p>
-            <w:pPr>
-              <w:spacing w:before="60" w:after="60" w:line="240" w:lineRule="auto"/>
-              <w:jc w:val="center"/>
-            </w:pPr>
-            <w:r>
-              <w:rPr>
-                <w:rFonts w:ascii="Times New Roman" w:hAnsi="Times New Roman"/>
-                <w:b w:val="0"/>
-                <w:color w:val="000000"/>
-                <w:sz w:val="18"/>
-              </w:rPr>
-            </w:r>
-          </w:p>
-        </w:tc>
-        <w:tc>
-          <w:tcPr>
-            <w:tcW w:w="424" w:type="dxa"/>
-            <w:shd w:val="clear" w:color="auto" w:fill="FFFFFF"/>
-          </w:tcPr>
-          <w:p>
-            <w:pPr>
-              <w:spacing w:before="60" w:after="60" w:line="240" w:lineRule="auto"/>
-              <w:jc w:val="center"/>
-            </w:pPr>
-            <w:r>
-              <w:rPr>
-                <w:rFonts w:ascii="Times New Roman" w:hAnsi="Times New Roman"/>
-                <w:b w:val="0"/>
-                <w:color w:val="000000"/>
-                <w:sz w:val="18"/>
-              </w:rPr>
-            </w:r>
-          </w:p>
-        </w:tc>
-        <w:tc>
-          <w:tcPr>
-            <w:tcW w:w="424" w:type="dxa"/>
-            <w:shd w:val="clear" w:color="auto" w:fill="FFFFFF"/>
-          </w:tcPr>
-          <w:p>
-            <w:pPr>
-              <w:spacing w:before="60" w:after="60" w:line="240" w:lineRule="auto"/>
-              <w:jc w:val="center"/>
-            </w:pPr>
-            <w:r>
-              <w:rPr>
-                <w:rFonts w:ascii="Times New Roman" w:hAnsi="Times New Roman"/>
-                <w:b w:val="0"/>
-                <w:color w:val="000000"/>
-                <w:sz w:val="18"/>
-              </w:rPr>
-            </w:r>
-          </w:p>
-        </w:tc>
-        <w:tc>
-          <w:tcPr>
-            <w:tcW w:w="424" w:type="dxa"/>
-            <w:shd w:val="clear" w:color="auto" w:fill="FFFFFF"/>
-          </w:tcPr>
-          <w:p>
-            <w:pPr>
-              <w:spacing w:before="60" w:after="60" w:line="240" w:lineRule="auto"/>
-              <w:jc w:val="center"/>
-            </w:pPr>
-            <w:r>
-              <w:rPr>
-                <w:rFonts w:ascii="Times New Roman" w:hAnsi="Times New Roman"/>
-                <w:b w:val="0"/>
-                <w:color w:val="000000"/>
-                <w:sz w:val="18"/>
-              </w:rPr>
-            </w:r>
-          </w:p>
-        </w:tc>
-        <w:tc>
-          <w:tcPr>
-            <w:tcW w:w="424" w:type="dxa"/>
-            <w:shd w:val="clear" w:color="auto" w:fill="70AD47"/>
-          </w:tcPr>
-          <w:p>
-            <w:pPr>
-              <w:spacing w:before="60" w:after="60" w:line="240" w:lineRule="auto"/>
-              <w:jc w:val="center"/>
-            </w:pPr>
-            <w:r>
-              <w:rPr>
-                <w:rFonts w:ascii="Times New Roman" w:hAnsi="Times New Roman"/>
-                <w:b w:val="0"/>
-                <w:color w:val="FFFFFF"/>
-                <w:sz w:val="18"/>
-              </w:rPr>
-              <w:t>✓</w:t>
-            </w:r>
-          </w:p>
-        </w:tc>
-        <w:tc>
-          <w:tcPr>
-            <w:tcW w:w="424" w:type="dxa"/>
-            <w:shd w:val="clear" w:color="auto" w:fill="FFFFFF"/>
-          </w:tcPr>
-          <w:p>
-            <w:pPr>
-              <w:spacing w:before="60" w:after="60" w:line="240" w:lineRule="auto"/>
-              <w:jc w:val="center"/>
-            </w:pPr>
-            <w:r>
-              <w:rPr>
-                <w:rFonts w:ascii="Times New Roman" w:hAnsi="Times New Roman"/>
-                <w:b w:val="0"/>
-                <w:color w:val="000000"/>
-                <w:sz w:val="18"/>
-              </w:rPr>
-            </w:r>
-          </w:p>
-        </w:tc>
-        <w:tc>
-          <w:tcPr>
-            <w:tcW w:w="424" w:type="dxa"/>
-            <w:shd w:val="clear" w:color="auto" w:fill="FFFFFF"/>
-          </w:tcPr>
-          <w:p>
-            <w:pPr>
-              <w:spacing w:before="60" w:after="60" w:line="240" w:lineRule="auto"/>
-              <w:jc w:val="center"/>
-            </w:pPr>
-            <w:r>
-              <w:rPr>
-                <w:rFonts w:ascii="Times New Roman" w:hAnsi="Times New Roman"/>
-                <w:b w:val="0"/>
-                <w:color w:val="000000"/>
-                <w:sz w:val="18"/>
-              </w:rPr>
-            </w:r>
-          </w:p>
-        </w:tc>
-        <w:tc>
-          <w:tcPr>
-            <w:tcW w:w="424" w:type="dxa"/>
-            <w:shd w:val="clear" w:color="auto" w:fill="FFFFFF"/>
-          </w:tcPr>
-          <w:p>
-            <w:pPr>
-              <w:spacing w:before="60" w:after="60" w:line="240" w:lineRule="auto"/>
-              <w:jc w:val="center"/>
-            </w:pPr>
-            <w:r>
-              <w:rPr>
-                <w:rFonts w:ascii="Times New Roman" w:hAnsi="Times New Roman"/>
-                <w:b w:val="0"/>
-                <w:color w:val="000000"/>
-                <w:sz w:val="18"/>
-              </w:rPr>
-            </w:r>
-          </w:p>
-        </w:tc>
-      </w:tr>
-      <w:tr>
-        <w:tc>
-          <w:tcPr>
-            <w:tcW w:w="4873" w:type="dxa"/>
-            <w:shd w:val="clear" w:color="auto" w:fill="D9E1F2"/>
-          </w:tcPr>
-          <w:p>
-            <w:pPr>
-              <w:spacing w:before="60" w:after="60" w:line="240" w:lineRule="auto"/>
-              <w:jc w:val="both"/>
-            </w:pPr>
-            <w:r>
-              <w:rPr>
-                <w:rFonts w:ascii="Times New Roman" w:hAnsi="Times New Roman"/>
-                <w:b w:val="0"/>
-                <w:color w:val="000000"/>
-                <w:sz w:val="20"/>
-              </w:rPr>
-              <w:t>Integración con la base de datos y desarrollo de consultas.</w:t>
-            </w:r>
-          </w:p>
-        </w:tc>
-        <w:tc>
-          <w:tcPr>
-            <w:tcW w:w="424" w:type="dxa"/>
-            <w:shd w:val="clear" w:color="auto" w:fill="D9E1F2"/>
-          </w:tcPr>
-          <w:p>
-            <w:pPr>
-              <w:spacing w:before="60" w:after="60" w:line="240" w:lineRule="auto"/>
-              <w:jc w:val="center"/>
-            </w:pPr>
-            <w:r>
-              <w:rPr>
-                <w:rFonts w:ascii="Times New Roman" w:hAnsi="Times New Roman"/>
-                <w:b w:val="0"/>
-                <w:color w:val="000000"/>
-                <w:sz w:val="18"/>
-              </w:rPr>
-            </w:r>
-          </w:p>
-        </w:tc>
-        <w:tc>
-          <w:tcPr>
-            <w:tcW w:w="424" w:type="dxa"/>
-            <w:shd w:val="clear" w:color="auto" w:fill="D9E1F2"/>
-          </w:tcPr>
-          <w:p>
-            <w:pPr>
-              <w:spacing w:before="60" w:after="60" w:line="240" w:lineRule="auto"/>
-              <w:jc w:val="center"/>
-            </w:pPr>
-            <w:r>
-              <w:rPr>
-                <w:rFonts w:ascii="Times New Roman" w:hAnsi="Times New Roman"/>
-                <w:b w:val="0"/>
-                <w:color w:val="000000"/>
-                <w:sz w:val="18"/>
-              </w:rPr>
-            </w:r>
-          </w:p>
-        </w:tc>
-        <w:tc>
-          <w:tcPr>
-            <w:tcW w:w="424" w:type="dxa"/>
-            <w:shd w:val="clear" w:color="auto" w:fill="D9E1F2"/>
-          </w:tcPr>
-          <w:p>
-            <w:pPr>
-              <w:spacing w:before="60" w:after="60" w:line="240" w:lineRule="auto"/>
-              <w:jc w:val="center"/>
-            </w:pPr>
-            <w:r>
-              <w:rPr>
-                <w:rFonts w:ascii="Times New Roman" w:hAnsi="Times New Roman"/>
-                <w:b w:val="0"/>
-                <w:color w:val="000000"/>
-                <w:sz w:val="18"/>
-              </w:rPr>
-            </w:r>
-          </w:p>
-        </w:tc>
-        <w:tc>
-          <w:tcPr>
-            <w:tcW w:w="424" w:type="dxa"/>
-            <w:shd w:val="clear" w:color="auto" w:fill="D9E1F2"/>
-          </w:tcPr>
-          <w:p>
-            <w:pPr>
-              <w:spacing w:before="60" w:after="60" w:line="240" w:lineRule="auto"/>
-              <w:jc w:val="center"/>
-            </w:pPr>
-            <w:r>
-              <w:rPr>
-                <w:rFonts w:ascii="Times New Roman" w:hAnsi="Times New Roman"/>
-                <w:b w:val="0"/>
-                <w:color w:val="000000"/>
-                <w:sz w:val="18"/>
-              </w:rPr>
-            </w:r>
-          </w:p>
-        </w:tc>
-        <w:tc>
-          <w:tcPr>
-            <w:tcW w:w="424" w:type="dxa"/>
-            <w:shd w:val="clear" w:color="auto" w:fill="D9E1F2"/>
-          </w:tcPr>
-          <w:p>
-            <w:pPr>
-              <w:spacing w:before="60" w:after="60" w:line="240" w:lineRule="auto"/>
-              <w:jc w:val="center"/>
-            </w:pPr>
-            <w:r>
-              <w:rPr>
-                <w:rFonts w:ascii="Times New Roman" w:hAnsi="Times New Roman"/>
-                <w:b w:val="0"/>
-                <w:color w:val="000000"/>
-                <w:sz w:val="18"/>
-              </w:rPr>
-            </w:r>
-          </w:p>
-        </w:tc>
-        <w:tc>
-          <w:tcPr>
-            <w:tcW w:w="424" w:type="dxa"/>
-            <w:shd w:val="clear" w:color="auto" w:fill="70AD47"/>
-          </w:tcPr>
-          <w:p>
-            <w:pPr>
-              <w:spacing w:before="60" w:after="60" w:line="240" w:lineRule="auto"/>
-              <w:jc w:val="center"/>
-            </w:pPr>
-            <w:r>
-              <w:rPr>
-                <w:rFonts w:ascii="Times New Roman" w:hAnsi="Times New Roman"/>
-                <w:b w:val="0"/>
-                <w:color w:val="FFFFFF"/>
-                <w:sz w:val="18"/>
-              </w:rPr>
-              <w:t>✓</w:t>
-            </w:r>
-          </w:p>
-        </w:tc>
-        <w:tc>
-          <w:tcPr>
-            <w:tcW w:w="424" w:type="dxa"/>
-            <w:shd w:val="clear" w:color="auto" w:fill="D9E1F2"/>
-          </w:tcPr>
-          <w:p>
-            <w:pPr>
-              <w:spacing w:before="60" w:after="60" w:line="240" w:lineRule="auto"/>
-              <w:jc w:val="center"/>
-            </w:pPr>
-            <w:r>
-              <w:rPr>
-                <w:rFonts w:ascii="Times New Roman" w:hAnsi="Times New Roman"/>
-                <w:b w:val="0"/>
-                <w:color w:val="000000"/>
-                <w:sz w:val="18"/>
-              </w:rPr>
-            </w:r>
-          </w:p>
-        </w:tc>
-        <w:tc>
-          <w:tcPr>
-            <w:tcW w:w="424" w:type="dxa"/>
-            <w:shd w:val="clear" w:color="auto" w:fill="D9E1F2"/>
-          </w:tcPr>
-          <w:p>
-            <w:pPr>
-              <w:spacing w:before="60" w:after="60" w:line="240" w:lineRule="auto"/>
-              <w:jc w:val="center"/>
-            </w:pPr>
-            <w:r>
-              <w:rPr>
-                <w:rFonts w:ascii="Times New Roman" w:hAnsi="Times New Roman"/>
-                <w:b w:val="0"/>
-                <w:color w:val="000000"/>
-                <w:sz w:val="18"/>
-              </w:rPr>
-            </w:r>
-          </w:p>
-        </w:tc>
-      </w:tr>
-      <w:tr>
-        <w:tc>
-          <w:tcPr>
-            <w:tcW w:w="4873" w:type="dxa"/>
-            <w:shd w:val="clear" w:color="auto" w:fill="FFFFFF"/>
-          </w:tcPr>
-          <w:p>
-            <w:pPr>
-              <w:spacing w:before="60" w:after="60" w:line="240" w:lineRule="auto"/>
-              <w:jc w:val="both"/>
-            </w:pPr>
-            <w:r>
-              <w:rPr>
-                <w:rFonts w:ascii="Times New Roman" w:hAnsi="Times New Roman"/>
-                <w:b w:val="0"/>
-                <w:color w:val="000000"/>
-                <w:sz w:val="20"/>
-              </w:rPr>
-              <w:t>Pruebas funcionales de trazabilidad y generación de reportes.</w:t>
+              <w:t>Integración, pruebas funcionales y consolidación del sistema.</w:t>
             </w:r>
           </w:p>
         </w:tc>
@@ -4945,7 +4689,93 @@
         <w:tc>
           <w:tcPr>
             <w:tcW w:w="424" w:type="dxa"/>
-            <w:shd w:val="clear" w:color="auto" w:fill="FFFFFF"/>
+            <w:shd w:val="clear" w:color="auto" w:fill="70AD47"/>
+          </w:tcPr>
+          <w:p>
+            <w:pPr>
+              <w:spacing w:before="60" w:after="60" w:line="240" w:lineRule="auto"/>
+              <w:jc w:val="center"/>
+            </w:pPr>
+            <w:r>
+              <w:rPr>
+                <w:rFonts w:ascii="Times New Roman" w:hAnsi="Times New Roman"/>
+                <w:b w:val="0"/>
+                <w:color w:val="FFFFFF"/>
+                <w:sz w:val="18"/>
+              </w:rPr>
+              <w:t>✓</w:t>
+            </w:r>
+          </w:p>
+        </w:tc>
+        <w:tc>
+          <w:tcPr>
+            <w:tcW w:w="424" w:type="dxa"/>
+            <w:shd w:val="clear" w:color="auto" w:fill="70AD47"/>
+          </w:tcPr>
+          <w:p>
+            <w:pPr>
+              <w:spacing w:before="60" w:after="60" w:line="240" w:lineRule="auto"/>
+              <w:jc w:val="center"/>
+            </w:pPr>
+            <w:r>
+              <w:rPr>
+                <w:rFonts w:ascii="Times New Roman" w:hAnsi="Times New Roman"/>
+                <w:b w:val="0"/>
+                <w:color w:val="FFFFFF"/>
+                <w:sz w:val="18"/>
+              </w:rPr>
+              <w:t>✓</w:t>
+            </w:r>
+          </w:p>
+        </w:tc>
+      </w:tr>
+      <w:tr>
+        <w:tc>
+          <w:tcPr>
+            <w:tcW w:w="4448" w:type="dxa"/>
+            <w:shd w:val="clear" w:color="auto" w:fill="D9E1F2"/>
+          </w:tcPr>
+          <w:p>
+            <w:pPr>
+              <w:spacing w:before="60" w:after="60" w:line="240" w:lineRule="auto"/>
+              <w:jc w:val="both"/>
+            </w:pPr>
+            <w:r>
+              <w:rPr>
+                <w:rFonts w:ascii="Times New Roman" w:hAnsi="Times New Roman"/>
+                <w:b w:val="0"/>
+                <w:color w:val="000000"/>
+                <w:sz w:val="20"/>
+              </w:rPr>
+              <w:t>Inducción institucional y capacitación en seguridad (SIAHO).</w:t>
+            </w:r>
+          </w:p>
+        </w:tc>
+        <w:tc>
+          <w:tcPr>
+            <w:tcW w:w="424" w:type="dxa"/>
+            <w:shd w:val="clear" w:color="auto" w:fill="70AD47"/>
+          </w:tcPr>
+          <w:p>
+            <w:pPr>
+              <w:spacing w:before="60" w:after="60" w:line="240" w:lineRule="auto"/>
+              <w:jc w:val="center"/>
+            </w:pPr>
+            <w:r>
+              <w:rPr>
+                <w:rFonts w:ascii="Times New Roman" w:hAnsi="Times New Roman"/>
+                <w:b w:val="0"/>
+                <w:color w:val="FFFFFF"/>
+                <w:sz w:val="18"/>
+              </w:rPr>
+              <w:t>✓</w:t>
+            </w:r>
+          </w:p>
+        </w:tc>
+        <w:tc>
+          <w:tcPr>
+            <w:tcW w:w="424" w:type="dxa"/>
+            <w:shd w:val="clear" w:color="auto" w:fill="D9E1F2"/>
           </w:tcPr>
           <w:p>
             <w:pPr>
@@ -4962,26 +4792,44 @@
             </w:r>
           </w:p>
         </w:tc>
-      </w:tr>
-      <w:tr>
         <w:tc>
           <w:tcPr>
-            <w:tcW w:w="4873" w:type="dxa"/>
+            <w:tcW w:w="424" w:type="dxa"/>
             <w:shd w:val="clear" w:color="auto" w:fill="D9E1F2"/>
           </w:tcPr>
           <w:p>
             <w:pPr>
               <w:spacing w:before="60" w:after="60" w:line="240" w:lineRule="auto"/>
-              <w:jc w:val="both"/>
+              <w:jc w:val="center"/>
             </w:pPr>
             <w:r>
               <w:rPr>
                 <w:rFonts w:ascii="Times New Roman" w:hAnsi="Times New Roman"/>
                 <w:b w:val="0"/>
                 <w:color w:val="000000"/>
-                <w:sz w:val="20"/>
+                <w:sz w:val="18"/>
               </w:rPr>
-              <w:t>Consolidación técnica y redacción del informe final.</w:t>
+            </w:r>
+          </w:p>
+        </w:tc>
+        <w:tc>
+          <w:tcPr>
+            <w:tcW w:w="424" w:type="dxa"/>
+            <w:shd w:val="clear" w:color="auto" w:fill="70AD47"/>
+          </w:tcPr>
+          <w:p>
+            <w:pPr>
+              <w:spacing w:before="60" w:after="60" w:line="240" w:lineRule="auto"/>
+              <w:jc w:val="center"/>
+            </w:pPr>
+            <w:r>
+              <w:rPr>
+                <w:rFonts w:ascii="Times New Roman" w:hAnsi="Times New Roman"/>
+                <w:b w:val="0"/>
+                <w:color w:val="FFFFFF"/>
+                <w:sz w:val="18"/>
+              </w:rPr>
+              <w:t>✓</w:t>
             </w:r>
           </w:p>
         </w:tc>
@@ -5042,6 +4890,274 @@
                 <w:color w:val="000000"/>
                 <w:sz w:val="18"/>
               </w:rPr>
+            </w:r>
+          </w:p>
+        </w:tc>
+        <w:tc>
+          <w:tcPr>
+            <w:tcW w:w="424" w:type="dxa"/>
+            <w:shd w:val="clear" w:color="auto" w:fill="D9E1F2"/>
+          </w:tcPr>
+          <w:p>
+            <w:pPr>
+              <w:spacing w:before="60" w:after="60" w:line="240" w:lineRule="auto"/>
+              <w:jc w:val="center"/>
+            </w:pPr>
+            <w:r>
+              <w:rPr>
+                <w:rFonts w:ascii="Times New Roman" w:hAnsi="Times New Roman"/>
+                <w:b w:val="0"/>
+                <w:color w:val="000000"/>
+                <w:sz w:val="18"/>
+              </w:rPr>
+            </w:r>
+          </w:p>
+        </w:tc>
+        <w:tc>
+          <w:tcPr>
+            <w:tcW w:w="424" w:type="dxa"/>
+            <w:shd w:val="clear" w:color="auto" w:fill="D9E1F2"/>
+          </w:tcPr>
+          <w:p>
+            <w:pPr>
+              <w:spacing w:before="60" w:after="60" w:line="240" w:lineRule="auto"/>
+              <w:jc w:val="center"/>
+            </w:pPr>
+            <w:r>
+              <w:rPr>
+                <w:rFonts w:ascii="Times New Roman" w:hAnsi="Times New Roman"/>
+                <w:b w:val="0"/>
+                <w:color w:val="000000"/>
+                <w:sz w:val="18"/>
+              </w:rPr>
+            </w:r>
+          </w:p>
+        </w:tc>
+      </w:tr>
+      <w:tr>
+        <w:tc>
+          <w:tcPr>
+            <w:tcW w:w="4448" w:type="dxa"/>
+            <w:shd w:val="clear" w:color="auto" w:fill="FFFFFF"/>
+          </w:tcPr>
+          <w:p>
+            <w:pPr>
+              <w:spacing w:before="60" w:after="60" w:line="240" w:lineRule="auto"/>
+              <w:jc w:val="both"/>
+            </w:pPr>
+            <w:r>
+              <w:rPr>
+                <w:rFonts w:ascii="Times New Roman" w:hAnsi="Times New Roman"/>
+                <w:b w:val="0"/>
+                <w:color w:val="000000"/>
+                <w:sz w:val="20"/>
+              </w:rPr>
+              <w:t>Registro y actualización de expedientes en hoja de cálculo.</w:t>
+            </w:r>
+          </w:p>
+        </w:tc>
+        <w:tc>
+          <w:tcPr>
+            <w:tcW w:w="424" w:type="dxa"/>
+            <w:shd w:val="clear" w:color="auto" w:fill="FFFFFF"/>
+          </w:tcPr>
+          <w:p>
+            <w:pPr>
+              <w:spacing w:before="60" w:after="60" w:line="240" w:lineRule="auto"/>
+              <w:jc w:val="center"/>
+            </w:pPr>
+            <w:r>
+              <w:rPr>
+                <w:rFonts w:ascii="Times New Roman" w:hAnsi="Times New Roman"/>
+                <w:b w:val="0"/>
+                <w:color w:val="000000"/>
+                <w:sz w:val="18"/>
+              </w:rPr>
+            </w:r>
+          </w:p>
+        </w:tc>
+        <w:tc>
+          <w:tcPr>
+            <w:tcW w:w="424" w:type="dxa"/>
+            <w:shd w:val="clear" w:color="auto" w:fill="70AD47"/>
+          </w:tcPr>
+          <w:p>
+            <w:pPr>
+              <w:spacing w:before="60" w:after="60" w:line="240" w:lineRule="auto"/>
+              <w:jc w:val="center"/>
+            </w:pPr>
+            <w:r>
+              <w:rPr>
+                <w:rFonts w:ascii="Times New Roman" w:hAnsi="Times New Roman"/>
+                <w:b w:val="0"/>
+                <w:color w:val="FFFFFF"/>
+                <w:sz w:val="18"/>
+              </w:rPr>
+              <w:t>✓</w:t>
+            </w:r>
+          </w:p>
+        </w:tc>
+        <w:tc>
+          <w:tcPr>
+            <w:tcW w:w="424" w:type="dxa"/>
+            <w:shd w:val="clear" w:color="auto" w:fill="70AD47"/>
+          </w:tcPr>
+          <w:p>
+            <w:pPr>
+              <w:spacing w:before="60" w:after="60" w:line="240" w:lineRule="auto"/>
+              <w:jc w:val="center"/>
+            </w:pPr>
+            <w:r>
+              <w:rPr>
+                <w:rFonts w:ascii="Times New Roman" w:hAnsi="Times New Roman"/>
+                <w:b w:val="0"/>
+                <w:color w:val="FFFFFF"/>
+                <w:sz w:val="18"/>
+              </w:rPr>
+              <w:t>✓</w:t>
+            </w:r>
+          </w:p>
+        </w:tc>
+        <w:tc>
+          <w:tcPr>
+            <w:tcW w:w="424" w:type="dxa"/>
+            <w:shd w:val="clear" w:color="auto" w:fill="FFFFFF"/>
+          </w:tcPr>
+          <w:p>
+            <w:pPr>
+              <w:spacing w:before="60" w:after="60" w:line="240" w:lineRule="auto"/>
+              <w:jc w:val="center"/>
+            </w:pPr>
+            <w:r>
+              <w:rPr>
+                <w:rFonts w:ascii="Times New Roman" w:hAnsi="Times New Roman"/>
+                <w:b w:val="0"/>
+                <w:color w:val="000000"/>
+                <w:sz w:val="18"/>
+              </w:rPr>
+            </w:r>
+          </w:p>
+        </w:tc>
+        <w:tc>
+          <w:tcPr>
+            <w:tcW w:w="424" w:type="dxa"/>
+            <w:shd w:val="clear" w:color="auto" w:fill="FFFFFF"/>
+          </w:tcPr>
+          <w:p>
+            <w:pPr>
+              <w:spacing w:before="60" w:after="60" w:line="240" w:lineRule="auto"/>
+              <w:jc w:val="center"/>
+            </w:pPr>
+            <w:r>
+              <w:rPr>
+                <w:rFonts w:ascii="Times New Roman" w:hAnsi="Times New Roman"/>
+                <w:b w:val="0"/>
+                <w:color w:val="000000"/>
+                <w:sz w:val="18"/>
+              </w:rPr>
+            </w:r>
+          </w:p>
+        </w:tc>
+        <w:tc>
+          <w:tcPr>
+            <w:tcW w:w="424" w:type="dxa"/>
+            <w:shd w:val="clear" w:color="auto" w:fill="FFFFFF"/>
+          </w:tcPr>
+          <w:p>
+            <w:pPr>
+              <w:spacing w:before="60" w:after="60" w:line="240" w:lineRule="auto"/>
+              <w:jc w:val="center"/>
+            </w:pPr>
+            <w:r>
+              <w:rPr>
+                <w:rFonts w:ascii="Times New Roman" w:hAnsi="Times New Roman"/>
+                <w:b w:val="0"/>
+                <w:color w:val="000000"/>
+                <w:sz w:val="18"/>
+              </w:rPr>
+            </w:r>
+          </w:p>
+        </w:tc>
+        <w:tc>
+          <w:tcPr>
+            <w:tcW w:w="424" w:type="dxa"/>
+            <w:shd w:val="clear" w:color="auto" w:fill="FFFFFF"/>
+          </w:tcPr>
+          <w:p>
+            <w:pPr>
+              <w:spacing w:before="60" w:after="60" w:line="240" w:lineRule="auto"/>
+              <w:jc w:val="center"/>
+            </w:pPr>
+            <w:r>
+              <w:rPr>
+                <w:rFonts w:ascii="Times New Roman" w:hAnsi="Times New Roman"/>
+                <w:b w:val="0"/>
+                <w:color w:val="000000"/>
+                <w:sz w:val="18"/>
+              </w:rPr>
+            </w:r>
+          </w:p>
+        </w:tc>
+        <w:tc>
+          <w:tcPr>
+            <w:tcW w:w="424" w:type="dxa"/>
+            <w:shd w:val="clear" w:color="auto" w:fill="FFFFFF"/>
+          </w:tcPr>
+          <w:p>
+            <w:pPr>
+              <w:spacing w:before="60" w:after="60" w:line="240" w:lineRule="auto"/>
+              <w:jc w:val="center"/>
+            </w:pPr>
+            <w:r>
+              <w:rPr>
+                <w:rFonts w:ascii="Times New Roman" w:hAnsi="Times New Roman"/>
+                <w:b w:val="0"/>
+                <w:color w:val="000000"/>
+                <w:sz w:val="18"/>
+              </w:rPr>
+            </w:r>
+          </w:p>
+        </w:tc>
+        <w:tc>
+          <w:tcPr>
+            <w:tcW w:w="424" w:type="dxa"/>
+            <w:shd w:val="clear" w:color="auto" w:fill="FFFFFF"/>
+          </w:tcPr>
+          <w:p>
+            <w:pPr>
+              <w:spacing w:before="60" w:after="60" w:line="240" w:lineRule="auto"/>
+              <w:jc w:val="center"/>
+            </w:pPr>
+            <w:r>
+              <w:rPr>
+                <w:rFonts w:ascii="Times New Roman" w:hAnsi="Times New Roman"/>
+                <w:b w:val="0"/>
+                <w:color w:val="000000"/>
+                <w:sz w:val="18"/>
+              </w:rPr>
+            </w:r>
+          </w:p>
+        </w:tc>
+      </w:tr>
+      <w:tr>
+        <w:tc>
+          <w:tcPr>
+            <w:tcW w:w="4448" w:type="dxa"/>
+            <w:shd w:val="clear" w:color="auto" w:fill="D9E1F2"/>
+          </w:tcPr>
+          <w:p>
+            <w:pPr>
+              <w:spacing w:before="60" w:after="60" w:line="240" w:lineRule="auto"/>
+              <w:jc w:val="both"/>
+            </w:pPr>
+            <w:r>
+              <w:rPr>
+                <w:rFonts w:ascii="Times New Roman" w:hAnsi="Times New Roman"/>
+                <w:b w:val="0"/>
+                <w:color w:val="000000"/>
+                <w:sz w:val="20"/>
+              </w:rPr>
+              <w:t>Revisión y canalización de correspondencia presidencial.</w:t>
             </w:r>
           </w:p>
         </w:tc>
@@ -5146,6 +5262,292 @@
             </w:r>
           </w:p>
         </w:tc>
+        <w:tc>
+          <w:tcPr>
+            <w:tcW w:w="424" w:type="dxa"/>
+            <w:shd w:val="clear" w:color="auto" w:fill="70AD47"/>
+          </w:tcPr>
+          <w:p>
+            <w:pPr>
+              <w:spacing w:before="60" w:after="60" w:line="240" w:lineRule="auto"/>
+              <w:jc w:val="center"/>
+            </w:pPr>
+            <w:r>
+              <w:rPr>
+                <w:rFonts w:ascii="Times New Roman" w:hAnsi="Times New Roman"/>
+                <w:b w:val="0"/>
+                <w:color w:val="FFFFFF"/>
+                <w:sz w:val="18"/>
+              </w:rPr>
+              <w:t>✓</w:t>
+            </w:r>
+          </w:p>
+        </w:tc>
+        <w:tc>
+          <w:tcPr>
+            <w:tcW w:w="424" w:type="dxa"/>
+            <w:shd w:val="clear" w:color="auto" w:fill="D9E1F2"/>
+          </w:tcPr>
+          <w:p>
+            <w:pPr>
+              <w:spacing w:before="60" w:after="60" w:line="240" w:lineRule="auto"/>
+              <w:jc w:val="center"/>
+            </w:pPr>
+            <w:r>
+              <w:rPr>
+                <w:rFonts w:ascii="Times New Roman" w:hAnsi="Times New Roman"/>
+                <w:b w:val="0"/>
+                <w:color w:val="000000"/>
+                <w:sz w:val="18"/>
+              </w:rPr>
+            </w:r>
+          </w:p>
+        </w:tc>
+        <w:tc>
+          <w:tcPr>
+            <w:tcW w:w="424" w:type="dxa"/>
+            <w:shd w:val="clear" w:color="auto" w:fill="D9E1F2"/>
+          </w:tcPr>
+          <w:p>
+            <w:pPr>
+              <w:spacing w:before="60" w:after="60" w:line="240" w:lineRule="auto"/>
+              <w:jc w:val="center"/>
+            </w:pPr>
+            <w:r>
+              <w:rPr>
+                <w:rFonts w:ascii="Times New Roman" w:hAnsi="Times New Roman"/>
+                <w:b w:val="0"/>
+                <w:color w:val="000000"/>
+                <w:sz w:val="18"/>
+              </w:rPr>
+            </w:r>
+          </w:p>
+        </w:tc>
+        <w:tc>
+          <w:tcPr>
+            <w:tcW w:w="424" w:type="dxa"/>
+            <w:shd w:val="clear" w:color="auto" w:fill="D9E1F2"/>
+          </w:tcPr>
+          <w:p>
+            <w:pPr>
+              <w:spacing w:before="60" w:after="60" w:line="240" w:lineRule="auto"/>
+              <w:jc w:val="center"/>
+            </w:pPr>
+            <w:r>
+              <w:rPr>
+                <w:rFonts w:ascii="Times New Roman" w:hAnsi="Times New Roman"/>
+                <w:b w:val="0"/>
+                <w:color w:val="000000"/>
+                <w:sz w:val="18"/>
+              </w:rPr>
+            </w:r>
+          </w:p>
+        </w:tc>
+      </w:tr>
+      <w:tr>
+        <w:tc>
+          <w:tcPr>
+            <w:tcW w:w="4448" w:type="dxa"/>
+            <w:shd w:val="clear" w:color="auto" w:fill="FFFFFF"/>
+          </w:tcPr>
+          <w:p>
+            <w:pPr>
+              <w:spacing w:before="60" w:after="60" w:line="240" w:lineRule="auto"/>
+              <w:jc w:val="both"/>
+            </w:pPr>
+            <w:r>
+              <w:rPr>
+                <w:rFonts w:ascii="Times New Roman" w:hAnsi="Times New Roman"/>
+                <w:b w:val="0"/>
+                <w:color w:val="000000"/>
+                <w:sz w:val="20"/>
+              </w:rPr>
+              <w:t>Apoyo en generación de reportes y cierre administrativo.</w:t>
+            </w:r>
+          </w:p>
+        </w:tc>
+        <w:tc>
+          <w:tcPr>
+            <w:tcW w:w="424" w:type="dxa"/>
+            <w:shd w:val="clear" w:color="auto" w:fill="FFFFFF"/>
+          </w:tcPr>
+          <w:p>
+            <w:pPr>
+              <w:spacing w:before="60" w:after="60" w:line="240" w:lineRule="auto"/>
+              <w:jc w:val="center"/>
+            </w:pPr>
+            <w:r>
+              <w:rPr>
+                <w:rFonts w:ascii="Times New Roman" w:hAnsi="Times New Roman"/>
+                <w:b w:val="0"/>
+                <w:color w:val="000000"/>
+                <w:sz w:val="18"/>
+              </w:rPr>
+            </w:r>
+          </w:p>
+        </w:tc>
+        <w:tc>
+          <w:tcPr>
+            <w:tcW w:w="424" w:type="dxa"/>
+            <w:shd w:val="clear" w:color="auto" w:fill="FFFFFF"/>
+          </w:tcPr>
+          <w:p>
+            <w:pPr>
+              <w:spacing w:before="60" w:after="60" w:line="240" w:lineRule="auto"/>
+              <w:jc w:val="center"/>
+            </w:pPr>
+            <w:r>
+              <w:rPr>
+                <w:rFonts w:ascii="Times New Roman" w:hAnsi="Times New Roman"/>
+                <w:b w:val="0"/>
+                <w:color w:val="000000"/>
+                <w:sz w:val="18"/>
+              </w:rPr>
+            </w:r>
+          </w:p>
+        </w:tc>
+        <w:tc>
+          <w:tcPr>
+            <w:tcW w:w="424" w:type="dxa"/>
+            <w:shd w:val="clear" w:color="auto" w:fill="FFFFFF"/>
+          </w:tcPr>
+          <w:p>
+            <w:pPr>
+              <w:spacing w:before="60" w:after="60" w:line="240" w:lineRule="auto"/>
+              <w:jc w:val="center"/>
+            </w:pPr>
+            <w:r>
+              <w:rPr>
+                <w:rFonts w:ascii="Times New Roman" w:hAnsi="Times New Roman"/>
+                <w:b w:val="0"/>
+                <w:color w:val="000000"/>
+                <w:sz w:val="18"/>
+              </w:rPr>
+            </w:r>
+          </w:p>
+        </w:tc>
+        <w:tc>
+          <w:tcPr>
+            <w:tcW w:w="424" w:type="dxa"/>
+            <w:shd w:val="clear" w:color="auto" w:fill="FFFFFF"/>
+          </w:tcPr>
+          <w:p>
+            <w:pPr>
+              <w:spacing w:before="60" w:after="60" w:line="240" w:lineRule="auto"/>
+              <w:jc w:val="center"/>
+            </w:pPr>
+            <w:r>
+              <w:rPr>
+                <w:rFonts w:ascii="Times New Roman" w:hAnsi="Times New Roman"/>
+                <w:b w:val="0"/>
+                <w:color w:val="000000"/>
+                <w:sz w:val="18"/>
+              </w:rPr>
+            </w:r>
+          </w:p>
+        </w:tc>
+        <w:tc>
+          <w:tcPr>
+            <w:tcW w:w="424" w:type="dxa"/>
+            <w:shd w:val="clear" w:color="auto" w:fill="FFFFFF"/>
+          </w:tcPr>
+          <w:p>
+            <w:pPr>
+              <w:spacing w:before="60" w:after="60" w:line="240" w:lineRule="auto"/>
+              <w:jc w:val="center"/>
+            </w:pPr>
+            <w:r>
+              <w:rPr>
+                <w:rFonts w:ascii="Times New Roman" w:hAnsi="Times New Roman"/>
+                <w:b w:val="0"/>
+                <w:color w:val="000000"/>
+                <w:sz w:val="18"/>
+              </w:rPr>
+            </w:r>
+          </w:p>
+        </w:tc>
+        <w:tc>
+          <w:tcPr>
+            <w:tcW w:w="424" w:type="dxa"/>
+            <w:shd w:val="clear" w:color="auto" w:fill="FFFFFF"/>
+          </w:tcPr>
+          <w:p>
+            <w:pPr>
+              <w:spacing w:before="60" w:after="60" w:line="240" w:lineRule="auto"/>
+              <w:jc w:val="center"/>
+            </w:pPr>
+            <w:r>
+              <w:rPr>
+                <w:rFonts w:ascii="Times New Roman" w:hAnsi="Times New Roman"/>
+                <w:b w:val="0"/>
+                <w:color w:val="000000"/>
+                <w:sz w:val="18"/>
+              </w:rPr>
+            </w:r>
+          </w:p>
+        </w:tc>
+        <w:tc>
+          <w:tcPr>
+            <w:tcW w:w="424" w:type="dxa"/>
+            <w:shd w:val="clear" w:color="auto" w:fill="FFFFFF"/>
+          </w:tcPr>
+          <w:p>
+            <w:pPr>
+              <w:spacing w:before="60" w:after="60" w:line="240" w:lineRule="auto"/>
+              <w:jc w:val="center"/>
+            </w:pPr>
+            <w:r>
+              <w:rPr>
+                <w:rFonts w:ascii="Times New Roman" w:hAnsi="Times New Roman"/>
+                <w:b w:val="0"/>
+                <w:color w:val="000000"/>
+                <w:sz w:val="18"/>
+              </w:rPr>
+            </w:r>
+          </w:p>
+        </w:tc>
+        <w:tc>
+          <w:tcPr>
+            <w:tcW w:w="424" w:type="dxa"/>
+            <w:shd w:val="clear" w:color="auto" w:fill="70AD47"/>
+          </w:tcPr>
+          <w:p>
+            <w:pPr>
+              <w:spacing w:before="60" w:after="60" w:line="240" w:lineRule="auto"/>
+              <w:jc w:val="center"/>
+            </w:pPr>
+            <w:r>
+              <w:rPr>
+                <w:rFonts w:ascii="Times New Roman" w:hAnsi="Times New Roman"/>
+                <w:b w:val="0"/>
+                <w:color w:val="FFFFFF"/>
+                <w:sz w:val="18"/>
+              </w:rPr>
+              <w:t>✓</w:t>
+            </w:r>
+          </w:p>
+        </w:tc>
+        <w:tc>
+          <w:tcPr>
+            <w:tcW w:w="424" w:type="dxa"/>
+            <w:shd w:val="clear" w:color="auto" w:fill="70AD47"/>
+          </w:tcPr>
+          <w:p>
+            <w:pPr>
+              <w:spacing w:before="60" w:after="60" w:line="240" w:lineRule="auto"/>
+              <w:jc w:val="center"/>
+            </w:pPr>
+            <w:r>
+              <w:rPr>
+                <w:rFonts w:ascii="Times New Roman" w:hAnsi="Times New Roman"/>
+                <w:b w:val="0"/>
+                <w:color w:val="FFFFFF"/>
+                <w:sz w:val="18"/>
+              </w:rPr>
+              <w:t>✓</w:t>
+            </w:r>
+          </w:p>
+        </w:tc>
       </w:tr>
     </w:tbl>
     <w:p/>
@@ -5669,7 +6071,7 @@
           <w:i w:val="0"/>
           <w:sz w:val="24"/>
         </w:rPr>
-        <w:t>Durante las ocho (8) semanas de práctica profesional, se ejecutaron fases sucesivas de análisis, diseño y desarrollo de software, integrando la operativa departamental con la investigación técnica:</w:t>
+        <w:t>Durante las nueve (9) semanas de práctica profesional, se ejecutaron fases sucesivas de análisis, diseño y desarrollo de software, integrando la operativa departamental con la investigación técnica:</w:t>
       </w:r>
     </w:p>
     <w:p>
@@ -5712,7 +6114,7 @@
           <w:rFonts w:ascii="Times New Roman" w:hAnsi="Times New Roman"/>
           <w:sz w:val="24"/>
         </w:rPr>
-        <w:t>Inducción al Departamento de Presidencia, reconocimiento del flujo procedimental de recepción, revisión y despacho de expedientes, y familiarización con el personal administrativo y las herramientas de registro en uso.</w:t>
+        <w:t>Inducción institucional por la Gerencia de Recursos Humanos, recorrido por las instalaciones del área administrativa, presentación del equipo de trabajo y revisión de protocolos de seguridad, confidencialidad y manejo de información.</w:t>
       </w:r>
     </w:p>
     <w:p>
@@ -5741,7 +6143,7 @@
           <w:rFonts w:ascii="Times New Roman" w:hAnsi="Times New Roman"/>
           <w:sz w:val="24"/>
         </w:rPr>
-        <w:t>Inicio del diagnóstico situacional mediante observación directa del proceso documental, identificación de las debilidades del sistema de registro manual y formulación preliminar de la situación problemática.</w:t>
+        <w:t>Observación directa y mapeo del ciclo de vida de los documentos en Presidencia, detección de fallas procedimentales en el registro manual y levantamiento de los campos y atributos requeridos para la base de datos de trazabilidad.</w:t>
       </w:r>
     </w:p>
     <w:p>
@@ -5784,7 +6186,7 @@
           <w:rFonts w:ascii="Times New Roman" w:hAnsi="Times New Roman"/>
           <w:sz w:val="24"/>
         </w:rPr>
-        <w:t>Apoyo en las labores de recepción y registro de expedientes del departamento, aplicando los procedimientos establecidos bajo supervisión de la tutora industrial.</w:t>
+        <w:t>Transmisión, clasificación y registro manual de expedientes físicos en la hoja de cálculo institucional preexistente, y actualización continua de datos de nuevos documentos recibidos durante el período.</w:t>
       </w:r>
     </w:p>
     <w:p>
@@ -5813,7 +6215,7 @@
           <w:rFonts w:ascii="Times New Roman" w:hAnsi="Times New Roman"/>
           <w:sz w:val="24"/>
         </w:rPr>
-        <w:t>Redacción del diagnóstico situacional en sus tres niveles (macro, meso y micro) y definición de los objetivos general y específicos del proyecto factible.</w:t>
+        <w:t>Validación de requerimientos con el tutor industrial, construcción del diagrama Entidad-Relación, aplicación de las formas normales sobre el esquema propuesto y elaboración formal del diccionario de datos.</w:t>
       </w:r>
     </w:p>
     <w:p>
@@ -5856,7 +6258,7 @@
           <w:rFonts w:ascii="Times New Roman" w:hAnsi="Times New Roman"/>
           <w:sz w:val="24"/>
         </w:rPr>
-        <w:t>Colaboración en las tareas de revisión ortográfica y de formato de correspondencia presidencial, y apoyo en el registro de salida de expedientes firmados.</w:t>
+        <w:t>Procesamiento y actualización del estatus de expedientes en el archivo Excel de la oficina, con apoyo administrativo en el control de documentos recibidos durante la semana.</w:t>
       </w:r>
     </w:p>
     <w:p>
@@ -5885,7 +6287,7 @@
           <w:rFonts w:ascii="Times New Roman" w:hAnsi="Times New Roman"/>
           <w:sz w:val="24"/>
         </w:rPr>
-        <w:t>Diseño del modelo relacional de la base de datos, aplicación de reglas de normalización y elaboración del diccionario de datos con los campos requeridos por el departamento.</w:t>
+        <w:t>Ejecución de la secuencia de comandos estructurales en SQLite, migración de registros históricos validados, construcción de formularios de captura y programación de consultas de trazabilidad con detección de limitaciones técnicas del entorno inicial.</w:t>
       </w:r>
     </w:p>
     <w:p>
@@ -5928,7 +6330,7 @@
           <w:rFonts w:ascii="Times New Roman" w:hAnsi="Times New Roman"/>
           <w:sz w:val="24"/>
         </w:rPr>
-        <w:t>Participación en la organización y archivo físico de expedientes del período, apoyando al personal en la gestión del volumen documental concurrente.</w:t>
+        <w:t>Asistencia a la charla técnica sobre Identificación y Notificación de Peligros y Riesgos en Instalaciones y Puestos de Trabajo dictada por el departamento de SIAHO, y carga de expedientes recibidos en la hoja de cálculo.</w:t>
       </w:r>
     </w:p>
     <w:p>
@@ -5957,7 +6359,7 @@
           <w:rFonts w:ascii="Times New Roman" w:hAnsi="Times New Roman"/>
           <w:sz w:val="24"/>
         </w:rPr>
-        <w:t>Despliegue del esquema de la base de datos en el motor SQLite y verificación del correcto almacenamiento de registros de prueba según el modelo diseñado.</w:t>
+        <w:t>Programación del entorno visual de escritorio mediante tecnologías de marcado y estilos, sincronización del código fuente en plataforma de control de versiones y planificación estructural de los esquemas remanentes.</w:t>
       </w:r>
     </w:p>
     <w:p>
@@ -6000,7 +6402,7 @@
           <w:rFonts w:ascii="Times New Roman" w:hAnsi="Times New Roman"/>
           <w:sz w:val="24"/>
         </w:rPr>
-        <w:t>Apoyo en la elaboración de resúmenes de estatus de expedientes solicitados por la directiva, aplicando los registros existentes en las hojas de cálculo del departamento.</w:t>
+        <w:t>Revisión ortográfica y de formato de correspondencia presidencial, y apoyo en la canalización de expedientes hacia su departamento de destino tras la firma presidencial.</w:t>
       </w:r>
     </w:p>
     <w:p>
@@ -6029,7 +6431,7 @@
           <w:rFonts w:ascii="Times New Roman" w:hAnsi="Times New Roman"/>
           <w:sz w:val="24"/>
         </w:rPr>
-        <w:t>Diseño y estructuración de la interfaz gráfica de usuario mediante código HTML, definiendo los módulos de ingreso, consulta y reporte de movimientos documentales.</w:t>
+        <w:t>Completación de los módulos visuales de consulta e historial de movimientos, integrando la lógica de visualización dinámica de expedientes por proceso administrativo.</w:t>
       </w:r>
     </w:p>
     <w:p>
@@ -6072,7 +6474,7 @@
           <w:rFonts w:ascii="Times New Roman" w:hAnsi="Times New Roman"/>
           <w:sz w:val="24"/>
         </w:rPr>
-        <w:t>Colaboración en la revisión y canalización de correspondencia presidencial, manteniendo el flujo operativo regular del departamento durante el desarrollo del proyecto.</w:t>
+        <w:t>Colaboración en la revisión y despacho de correspondencia presidencial y apoyo en el registro de salida de expedientes firmados durante el período.</w:t>
       </w:r>
     </w:p>
     <w:p>
@@ -6101,7 +6503,7 @@
           <w:rFonts w:ascii="Times New Roman" w:hAnsi="Times New Roman"/>
           <w:sz w:val="24"/>
         </w:rPr>
-        <w:t>Empaquetado del entorno visual web como aplicación de escritorio autónoma mediante el framework Wails e integración con la base de datos SQLite local.</w:t>
+        <w:t>Empaquetado de la aplicación de escritorio mediante el framework Wails con integración de WebView2 portable, logrando un ejecutable autónomo sin dependencias de instalación en el equipo corporativo.</w:t>
       </w:r>
     </w:p>
     <w:p>
@@ -6144,7 +6546,7 @@
           <w:rFonts w:ascii="Times New Roman" w:hAnsi="Times New Roman"/>
           <w:sz w:val="24"/>
         </w:rPr>
-        <w:t>Apoyo en la generación manual de reportes de expedientes para la alta dirección, documentando simultáneamente los requerimientos de reporte que guiarán la validación del sistema.</w:t>
+        <w:t>Apoyo en la elaboración manual de resúmenes de estatus de expedientes solicitados por la alta dirección, aplicando los registros de la hoja de cálculo del departamento.</w:t>
       </w:r>
     </w:p>
     <w:p>
@@ -6173,7 +6575,7 @@
           <w:rFonts w:ascii="Times New Roman" w:hAnsi="Times New Roman"/>
           <w:sz w:val="24"/>
         </w:rPr>
-        <w:t>Ejecución de pruebas de validación funcional del sistema, depuración de errores y verificación del correcto funcionamiento de los módulos de trazabilidad y generación de reportes.</w:t>
+        <w:t>Ejecución de pruebas de validación funcional del sistema, depuración de errores y verificación del correcto funcionamiento de los módulos de registro, trazabilidad y generación de reportes sobre datos reales.</w:t>
       </w:r>
     </w:p>
     <w:p>
@@ -6216,7 +6618,7 @@
           <w:rFonts w:ascii="Times New Roman" w:hAnsi="Times New Roman"/>
           <w:sz w:val="24"/>
         </w:rPr>
-        <w:t>Participación en las actividades regulares del departamento y presentación del prototipo funcional ante la tutora industrial para su evaluación y retroalimentación.</w:t>
+        <w:t>Participación en las actividades regulares del departamento y apoyo en el cierre administrativo del período, asistiendo en la organización final de expedientes del ciclo.</w:t>
       </w:r>
     </w:p>
     <w:p>
@@ -6245,7 +6647,79 @@
           <w:rFonts w:ascii="Times New Roman" w:hAnsi="Times New Roman"/>
           <w:sz w:val="24"/>
         </w:rPr>
-        <w:t>Elaboración de los manuales técnicos del sistema, estructuración final del código fuente y consolidación del informe académico de pasantías.</w:t>
+        <w:t>Redacción del informe técnico de pasantías, elaboración de los manuales de usuario y estructuración definitiva del código fuente para entrega.</w:t>
+      </w:r>
+    </w:p>
+    <w:p>
+      <w:pPr>
+        <w:spacing w:before="480" w:after="480" w:line="360" w:lineRule="auto"/>
+        <w:jc w:val="left"/>
+      </w:pPr>
+      <w:r>
+        <w:rPr>
+          <w:rFonts w:ascii="Times New Roman" w:hAnsi="Times New Roman"/>
+          <w:b/>
+          <w:sz w:val="24"/>
+        </w:rPr>
+        <w:t>Semana 9</w:t>
+      </w:r>
+    </w:p>
+    <w:p>
+      <w:pPr>
+        <w:spacing w:line="360" w:lineRule="auto"/>
+        <w:ind w:firstLine="709"/>
+        <w:jc w:val="both"/>
+      </w:pPr>
+      <w:r>
+        <w:rPr>
+          <w:rFonts w:ascii="Times New Roman" w:hAnsi="Times New Roman"/>
+          <w:sz w:val="24"/>
+        </w:rPr>
+        <w:t xml:space="preserve">1. </w:t>
+      </w:r>
+      <w:r>
+        <w:rPr>
+          <w:rFonts w:ascii="Times New Roman" w:hAnsi="Times New Roman"/>
+          <w:b/>
+          <w:sz w:val="24"/>
+        </w:rPr>
+        <w:t xml:space="preserve">Actividad operativa: </w:t>
+      </w:r>
+      <w:r>
+        <w:rPr>
+          <w:rFonts w:ascii="Times New Roman" w:hAnsi="Times New Roman"/>
+          <w:sz w:val="24"/>
+        </w:rPr>
+        <w:t>Presentación del prototipo funcional ante la tutora industrial para su evaluación, retroalimentación final y firma de la carta de aprobación del tutor industrial.</w:t>
+      </w:r>
+    </w:p>
+    <w:p>
+      <w:pPr>
+        <w:spacing w:line="360" w:lineRule="auto"/>
+        <w:ind w:firstLine="709"/>
+        <w:jc w:val="both"/>
+      </w:pPr>
+      <w:r>
+        <w:rPr>
+          <w:rFonts w:ascii="Times New Roman" w:hAnsi="Times New Roman"/>
+          <w:sz w:val="24"/>
+        </w:rPr>
+        <w:t xml:space="preserve">2. </w:t>
+      </w:r>
+      <w:r>
+        <w:rPr>
+          <w:rFonts w:ascii="Times New Roman" w:hAnsi="Times New Roman"/>
+          <w:b/>
+          <w:sz w:val="24"/>
+        </w:rPr>
+        <w:t xml:space="preserve">Actividad de investigación: </w:t>
+      </w:r>
+      <w:r>
+        <w:rPr>
+          <w:rFonts w:ascii="Times New Roman" w:hAnsi="Times New Roman"/>
+          <w:sz w:val="24"/>
+        </w:rPr>
+        <w:t>Consolidación y revisión final del informe académico, incorporación de observaciones del tutor industrial y preparación de los anexos definitivos para la entrega institucional.</w:t>
       </w:r>
     </w:p>
     <w:p>

</xml_diff>

<commit_message>
Juliano: tutor academico Ing. Mejias Jose
</commit_message>
<xml_diff>
--- a/juliano/reportes/Informe_Pasantia_IUTECP.docx
+++ b/juliano/reportes/Informe_Pasantia_IUTECP.docx
@@ -310,7 +310,7 @@
                 <w:b/>
                 <w:sz w:val="24"/>
               </w:rPr>
-              <w:t>Lic. Mendoza, Carlos</w:t>
+              <w:t>Ing. Mejías, José</w:t>
               <w:br/>
             </w:r>
             <w:r>
@@ -698,7 +698,7 @@
           <w:b/>
           <w:sz w:val="24"/>
         </w:rPr>
-        <w:t>Lic. Mendoza, Carlos</w:t>
+        <w:t>Ing. Mejías, José</w:t>
       </w:r>
     </w:p>
     <w:p>

</xml_diff>

<commit_message>
Actualizar título y DER de Juliano
</commit_message>
<xml_diff>
--- a/juliano/reportes/Informe_Pasantia_IUTECP.docx
+++ b/juliano/reportes/Informe_Pasantia_IUTECP.docx
@@ -54,7 +54,7 @@
     </w:p>
     <w:p>
       <w:pPr>
-        <w:spacing w:before="978" w:after="1334"/>
+        <w:spacing w:before="947" w:after="1242"/>
         <w:jc w:val="center"/>
       </w:pPr>
       <w:r>
@@ -103,12 +103,12 @@
           <w:b/>
           <w:sz w:val="24"/>
         </w:rPr>
-        <w:t>DESARROLLO DE UN PROTOTIPO DE SISTEMA PARA EL CONTROL, TRAZABILIDAD Y REPORTE DOCUMENTAL EN LA PRESIDENCIA DE VENANGOCUPET, S.A.</w:t>
+        <w:t>DESARROLLO DE UN PROTOTIPO DE SISTEMA PARA EL CONTROL, TRAZABILIDAD Y REPORTE DOCUMENTAL EN LA PRESIDENCIA DE LA EMPRESA MIXTA PETROLERA VENANGOCUPET, S.A.</w:t>
       </w:r>
     </w:p>
     <w:p>
       <w:pPr>
-        <w:spacing w:line="276" w:lineRule="auto" w:before="3260" w:after="0"/>
+        <w:spacing w:line="276" w:lineRule="auto" w:before="3158" w:after="0"/>
         <w:jc w:val="right"/>
       </w:pPr>
       <w:r>
@@ -140,7 +140,7 @@
     </w:p>
     <w:p>
       <w:pPr>
-        <w:spacing w:line="276" w:lineRule="auto" w:before="1630" w:after="0"/>
+        <w:spacing w:line="276" w:lineRule="auto" w:before="1579" w:after="0"/>
         <w:jc w:val="center"/>
       </w:pPr>
       <w:r>
@@ -226,7 +226,7 @@
           <w:b/>
           <w:sz w:val="24"/>
         </w:rPr>
-        <w:t>DESARROLLO DE UN PROTOTIPO DE SISTEMA PARA EL CONTROL, TRAZABILIDAD Y REPORTE DOCUMENTAL EN LA PRESIDENCIA DE VENANGOCUPET, S.A.</w:t>
+        <w:t>DESARROLLO DE UN PROTOTIPO DE SISTEMA PARA EL CONTROL, TRAZABILIDAD Y REPORTE DOCUMENTAL EN LA PRESIDENCIA DE LA EMPRESA MIXTA PETROLERA VENANGOCUPET, S.A.</w:t>
       </w:r>
     </w:p>
     <w:p>
@@ -503,7 +503,7 @@
           <w:rFonts w:ascii="Times New Roman" w:hAnsi="Times New Roman"/>
           <w:sz w:val="24"/>
         </w:rPr>
-        <w:t>En mi carácter de tutor industrial del informe de pasantías presentado por: Cardona, Juliano, de Cédula de Identidad V-32.281.199; para optar al grado de Técnico Superior Universitario en la especialidad de: Informática, cuyo título es; “DESARROLLO DE UN PROTOTIPO DE SISTEMA PARA EL CONTROL, TRAZABILIDAD Y REPORTE DOCUMENTAL EN LA PRESIDENCIA DE VENANGOCUPET, S.A.”, manifiesto que cumple con los requisitos exigidos por el Instituto Universitario de Tecnología “Elías Calixto Pompa” (IUTECP); y que, por lo tanto, considero que reúne los méritos suficientes para ser evaluado por el jurado que se decida designar a tal fin.</w:t>
+        <w:t>En mi carácter de tutor industrial del informe de pasantías presentado por: Cardona, Juliano, de Cédula de Identidad V-32.281.199; para optar al grado de Técnico Superior Universitario en la especialidad de: Informática, cuyo título es; “DESARROLLO DE UN PROTOTIPO DE SISTEMA PARA EL CONTROL, TRAZABILIDAD Y REPORTE DOCUMENTAL EN LA PRESIDENCIA DE LA EMPRESA MIXTA PETROLERA VENANGOCUPET, S.A.”, manifiesto que cumple con los requisitos exigidos por el Instituto Universitario de Tecnología “Elías Calixto Pompa” (IUTECP); y que, por lo tanto, considero que reúne los méritos suficientes para ser evaluado por el jurado que se decida designar a tal fin.</w:t>
       </w:r>
     </w:p>
     <w:p/>
@@ -672,7 +672,7 @@
           <w:rFonts w:ascii="Times New Roman" w:hAnsi="Times New Roman"/>
           <w:sz w:val="24"/>
         </w:rPr>
-        <w:t>En mi carácter de tutor académico del informe de pasantías presentado por: Cardona, Juliano, de Cédula de Identidad V-32.281.199; para optar al grado de Técnico Superior Universitario en la especialidad de: Informática, cuyo título es; “DESARROLLO DE UN PROTOTIPO DE SISTEMA PARA EL CONTROL, TRAZABILIDAD Y REPORTE DOCUMENTAL EN LA PRESIDENCIA DE VENANGOCUPET, S.A.”, manifiesto que cumple con los requisitos exigidos por el Instituto Universitario de Tecnología “Elías Calixto Pompa” (IUTECP); y que, por lo tanto, considero que reúne los méritos suficientes para ser evaluado por el jurado que se decida designar a tal fin.</w:t>
+        <w:t>En mi carácter de tutor académico del informe de pasantías presentado por: Cardona, Juliano, de Cédula de Identidad V-32.281.199; para optar al grado de Técnico Superior Universitario en la especialidad de: Informática, cuyo título es; “DESARROLLO DE UN PROTOTIPO DE SISTEMA PARA EL CONTROL, TRAZABILIDAD Y REPORTE DOCUMENTAL EN LA PRESIDENCIA DE LA EMPRESA MIXTA PETROLERA VENANGOCUPET, S.A.”, manifiesto que cumple con los requisitos exigidos por el Instituto Universitario de Tecnología “Elías Calixto Pompa” (IUTECP); y que, por lo tanto, considero que reúne los méritos suficientes para ser evaluado por el jurado que se decida designar a tal fin.</w:t>
       </w:r>
     </w:p>
     <w:p/>
@@ -2460,7 +2460,7 @@
         </w:rPr>
         <w:t>D</w:t>
         <w:tab/>
-        <w:t>Modelo relacional documental del prototipo</w:t>
+        <w:t>Diagrama entidad-relación del módulo de expedientes</w:t>
         <w:tab/>
       </w:r>
       <w:r>
@@ -2735,7 +2735,7 @@
           <w:b/>
           <w:sz w:val="24"/>
         </w:rPr>
-        <w:t>DESARROLLO DE UN PROTOTIPO DE SISTEMA PARA EL CONTROL, TRAZABILIDAD Y REPORTE DOCUMENTAL EN LA PRESIDENCIA DE VENANGOCUPET, S.A.</w:t>
+        <w:t>DESARROLLO DE UN PROTOTIPO DE SISTEMA PARA EL CONTROL, TRAZABILIDAD Y REPORTE DOCUMENTAL EN LA PRESIDENCIA DE LA EMPRESA MIXTA PETROLERA VENANGOCUPET, S.A.</w:t>
       </w:r>
     </w:p>
     <w:p>
@@ -5241,7 +5241,7 @@
                 <w:color w:val="000000"/>
                 <w:sz w:val="20"/>
               </w:rPr>
-              <w:t>Modelar la relación entre procesos y documentos, normalizar la estructura de datos y diseñar los módulos visuales.</w:t>
+              <w:t>Modelar los expedientes, catálogos, documentos asociados e historial de movimientos; normalizar la estructura de datos y diseñar los módulos visuales.</w:t>
             </w:r>
           </w:p>
         </w:tc>
@@ -8467,7 +8467,7 @@
           <w:i w:val="0"/>
           <w:sz w:val="24"/>
         </w:rPr>
-        <w:t>Date (2001) establece que un diseño relacional correctamente normalizado garantiza que cada dato se almacene una sola vez, reduciendo la posibilidad de inconsistencias derivadas de actualizaciones parciales. En el sistema propuesto, la relación entre procesos administrativos y documentos sigue una cardinalidad uno a muchos (1:N), permitiendo registrar múltiples expedientes asociados a un mismo proceso contractual o administrativo sin duplicar los datos maestros del proceso.</w:t>
+        <w:t>Date (2001) establece que un diseño relacional correctamente normalizado garantiza que cada dato se almacene una sola vez, reduciendo la posibilidad de inconsistencias derivadas de actualizaciones parciales. En el sistema implementado, la tabla expedientes se relaciona mediante claves foráneas con los catálogos de gerencia, superintendencia, responsables, modalidad, estatus, resultado y empresa. Los documentos se asocian mediante una tabla intermedia, mientras que los frentes adicionales y el historial de movimientos mantienen relaciones uno a muchos (1:N) con cada expediente.</w:t>
       </w:r>
     </w:p>
     <w:p>
@@ -8482,7 +8482,7 @@
           <w:i w:val="0"/>
           <w:sz w:val="24"/>
         </w:rPr>
-        <w:t>A juicio de quien suscribe, el modelo relacional resulta adecuado porque representa la relación entre procesos y documentos sin duplicar la información que se necesita consultar.</w:t>
+        <w:t>A juicio de quien suscribe, el modelo relacional resulta adecuado porque separa los datos maestros de los registros operativos y conserva la trazabilidad de cada expediente.</w:t>
       </w:r>
     </w:p>
     <w:p>
@@ -8526,7 +8526,7 @@
           <w:i w:val="0"/>
           <w:sz w:val="24"/>
         </w:rPr>
-        <w:t>Pressman (2010) señala que la selección de herramientas tecnológicas debe considerar las características del entorno de despliegue y los requerimientos reales de la solución. Para el prototipo desarrollado en el Departamento de Presidencia, SQLite permite gestionar las relaciones entre procesos y documentos, conservar el historial de movimientos y ejecutar consultas sin incorporar una infraestructura adicional de servidor.</w:t>
+        <w:t>Pressman (2010) señala que la selección de herramientas tecnológicas debe considerar las características del entorno de despliegue y los requerimientos reales de la solución. Para el prototipo desarrollado en el Departamento de Presidencia, SQLite permite gestionar las relaciones entre expedientes, catálogos y documentos, conservar el historial de movimientos y ejecutar consultas sin incorporar una infraestructura adicional de servidor.</w:t>
       </w:r>
     </w:p>
     <w:p>
@@ -9615,7 +9615,7 @@
           <w:rFonts w:ascii="Times New Roman" w:hAnsi="Times New Roman"/>
           <w:sz w:val="24"/>
         </w:rPr>
-        <w:t>Se diseñó una arquitectura relacional normalizada con SQLite y una interfaz de escritorio orientada a conservar una dinámica de uso sencilla, representando la relación uno a muchos entre procesos y documentos sin alterar el flujo operativo del departamento.</w:t>
+        <w:t>Se diseñó una arquitectura relacional normalizada con SQLite y una interfaz de escritorio orientada a conservar una dinámica de uso sencilla, relacionando expedientes con sus catálogos, documentos, frentes adicionales e historial de movimientos sin alterar el flujo operativo del departamento.</w:t>
       </w:r>
     </w:p>
     <w:p>
@@ -10258,7 +10258,7 @@
           <w:b/>
           <w:sz w:val="24"/>
         </w:rPr>
-        <w:t>[Modelo relacional documental del prototipo]</w:t>
+        <w:t>[Diagrama entidad-relación del módulo de expedientes]</w:t>
       </w:r>
     </w:p>
     <w:p>
@@ -10268,7 +10268,7 @@
       <w:r>
         <w:drawing>
           <wp:inline xmlns:a="http://schemas.openxmlformats.org/drawingml/2006/main" xmlns:pic="http://schemas.openxmlformats.org/drawingml/2006/picture">
-            <wp:extent cx="4160526" cy="3600000"/>
+            <wp:extent cx="5039999" cy="4452114"/>
             <wp:docPr id="9" name="Picture 9"/>
             <wp:cNvGraphicFramePr>
               <a:graphicFrameLocks noChangeAspect="1"/>
@@ -10289,7 +10289,7 @@
                   <pic:spPr>
                     <a:xfrm>
                       <a:off x="0" y="0"/>
-                      <a:ext cx="4160526" cy="3600000"/>
+                      <a:ext cx="5039999" cy="4452114"/>
                     </a:xfrm>
                     <a:prstGeom prst="rect"/>
                   </pic:spPr>
@@ -10312,7 +10312,7 @@
           <w:i w:val="0"/>
           <w:sz w:val="24"/>
         </w:rPr>
-        <w:t>Fuente: Elaboración propia (2026).</w:t>
+        <w:t>Fuente: Elaboración propia a partir de expedientes_schema.sql (2026).</w:t>
       </w:r>
     </w:p>
     <w:p>

</xml_diff>